<commit_message>
Revise KIE supplement and uncertainty diagnostics
</commit_message>
<xml_diff>
--- a/毕业论文/南京大学大气科学学院研究生学位论文开题报告.docx
+++ b/毕业论文/南京大学大气科学学院研究生学位论文开题报告.docx
@@ -131,7 +131,7 @@
           <w:szCs w:val="36"/>
           <w:u w:val="single"/>
         </w:rPr>
-        <w:t xml:space="preserve">           </w:t>
+        <w:t xml:space="preserve">          </w:t>
       </w:r>
       <w:r>
         <w:rPr>
@@ -140,6 +140,15 @@
           <w:szCs w:val="36"/>
           <w:u w:val="single"/>
         </w:rPr>
+        <w:t xml:space="preserve"> </w:t>
+      </w:r>
+      <w:r>
+        <w:rPr>
+          <w:rFonts w:ascii="华文中宋" w:eastAsia="华文中宋" w:hAnsi="华文中宋" w:hint="eastAsia"/>
+          <w:sz w:val="36"/>
+          <w:szCs w:val="36"/>
+          <w:u w:val="single"/>
+        </w:rPr>
         <w:t>鲍雨凡</w:t>
       </w:r>
       <w:r>
@@ -158,35 +167,53 @@
         <w:ind w:firstLineChars="425" w:firstLine="1530"/>
         <w:jc w:val="left"/>
         <w:rPr>
+          <w:rFonts w:ascii="华文中宋" w:eastAsia="华文中宋" w:hAnsi="华文中宋"/>
+          <w:sz w:val="36"/>
+          <w:szCs w:val="36"/>
+          <w:u w:val="single"/>
+        </w:rPr>
+      </w:pPr>
+      <w:r>
+        <w:rPr>
+          <w:rFonts w:ascii="华文中宋" w:eastAsia="华文中宋" w:hAnsi="华文中宋" w:hint="eastAsia"/>
+          <w:sz w:val="36"/>
+          <w:szCs w:val="36"/>
+        </w:rPr>
+        <w:t xml:space="preserve">学 </w:t>
+      </w:r>
+      <w:r>
+        <w:rPr>
+          <w:rFonts w:ascii="华文中宋" w:eastAsia="华文中宋" w:hAnsi="华文中宋"/>
+          <w:sz w:val="36"/>
+          <w:szCs w:val="36"/>
+        </w:rPr>
+        <w:t xml:space="preserve">   </w:t>
+      </w:r>
+      <w:r>
+        <w:rPr>
+          <w:rFonts w:ascii="华文中宋" w:eastAsia="华文中宋" w:hAnsi="华文中宋" w:hint="eastAsia"/>
+          <w:sz w:val="36"/>
+          <w:szCs w:val="36"/>
+        </w:rPr>
+        <w:t>号：</w:t>
+      </w:r>
+      <w:r>
+        <w:rPr>
           <w:rFonts w:ascii="华文中宋" w:eastAsia="华文中宋" w:hAnsi="华文中宋" w:hint="eastAsia"/>
           <w:sz w:val="36"/>
           <w:szCs w:val="36"/>
           <w:u w:val="single"/>
         </w:rPr>
-      </w:pPr>
-      <w:r>
-        <w:rPr>
-          <w:rFonts w:ascii="华文中宋" w:eastAsia="华文中宋" w:hAnsi="华文中宋" w:hint="eastAsia"/>
-          <w:sz w:val="36"/>
-          <w:szCs w:val="36"/>
-        </w:rPr>
-        <w:t xml:space="preserve">学 </w:t>
+        <w:t xml:space="preserve"> </w:t>
       </w:r>
       <w:r>
         <w:rPr>
           <w:rFonts w:ascii="华文中宋" w:eastAsia="华文中宋" w:hAnsi="华文中宋"/>
           <w:sz w:val="36"/>
           <w:szCs w:val="36"/>
-        </w:rPr>
-        <w:t xml:space="preserve">   </w:t>
-      </w:r>
-      <w:r>
-        <w:rPr>
-          <w:rFonts w:ascii="华文中宋" w:eastAsia="华文中宋" w:hAnsi="华文中宋" w:hint="eastAsia"/>
-          <w:sz w:val="36"/>
-          <w:szCs w:val="36"/>
-        </w:rPr>
-        <w:t>号：</w:t>
+          <w:u w:val="single"/>
+        </w:rPr>
+        <w:t xml:space="preserve">           </w:t>
       </w:r>
       <w:r>
         <w:rPr>
@@ -195,6 +222,51 @@
           <w:szCs w:val="36"/>
           <w:u w:val="single"/>
         </w:rPr>
+        <w:t>502024280002</w:t>
+      </w:r>
+    </w:p>
+    <w:p>
+      <w:pPr>
+        <w:spacing w:beforeLines="100" w:before="312" w:line="480" w:lineRule="auto"/>
+        <w:ind w:firstLineChars="425" w:firstLine="1530"/>
+        <w:jc w:val="left"/>
+        <w:rPr>
+          <w:rFonts w:ascii="华文中宋" w:eastAsia="华文中宋" w:hAnsi="华文中宋"/>
+          <w:sz w:val="36"/>
+          <w:szCs w:val="36"/>
+        </w:rPr>
+      </w:pPr>
+      <w:r>
+        <w:rPr>
+          <w:rFonts w:ascii="华文中宋" w:eastAsia="华文中宋" w:hAnsi="华文中宋" w:hint="eastAsia"/>
+          <w:sz w:val="36"/>
+          <w:szCs w:val="36"/>
+        </w:rPr>
+        <w:t xml:space="preserve">专 </w:t>
+      </w:r>
+      <w:r>
+        <w:rPr>
+          <w:rFonts w:ascii="华文中宋" w:eastAsia="华文中宋" w:hAnsi="华文中宋"/>
+          <w:sz w:val="36"/>
+          <w:szCs w:val="36"/>
+        </w:rPr>
+        <w:t xml:space="preserve">   </w:t>
+      </w:r>
+      <w:r>
+        <w:rPr>
+          <w:rFonts w:ascii="华文中宋" w:eastAsia="华文中宋" w:hAnsi="华文中宋" w:hint="eastAsia"/>
+          <w:sz w:val="36"/>
+          <w:szCs w:val="36"/>
+        </w:rPr>
+        <w:t>业：</w:t>
+      </w:r>
+      <w:r>
+        <w:rPr>
+          <w:rFonts w:ascii="华文中宋" w:eastAsia="华文中宋" w:hAnsi="华文中宋" w:hint="eastAsia"/>
+          <w:sz w:val="36"/>
+          <w:szCs w:val="36"/>
+          <w:u w:val="single"/>
+        </w:rPr>
         <w:t xml:space="preserve"> </w:t>
       </w:r>
       <w:r>
@@ -213,7 +285,16 @@
           <w:szCs w:val="36"/>
           <w:u w:val="single"/>
         </w:rPr>
-        <w:t>502024280002</w:t>
+        <w:t>大气科学</w:t>
+      </w:r>
+      <w:r>
+        <w:rPr>
+          <w:rFonts w:ascii="华文中宋" w:eastAsia="华文中宋" w:hAnsi="华文中宋"/>
+          <w:sz w:val="36"/>
+          <w:szCs w:val="36"/>
+          <w:u w:val="single"/>
+        </w:rPr>
+        <w:t xml:space="preserve">   </w:t>
       </w:r>
     </w:p>
     <w:p>
@@ -233,23 +314,7 @@
           <w:sz w:val="36"/>
           <w:szCs w:val="36"/>
         </w:rPr>
-        <w:t xml:space="preserve">专 </w:t>
-      </w:r>
-      <w:r>
-        <w:rPr>
-          <w:rFonts w:ascii="华文中宋" w:eastAsia="华文中宋" w:hAnsi="华文中宋"/>
-          <w:sz w:val="36"/>
-          <w:szCs w:val="36"/>
-        </w:rPr>
-        <w:t xml:space="preserve">   </w:t>
-      </w:r>
-      <w:r>
-        <w:rPr>
-          <w:rFonts w:ascii="华文中宋" w:eastAsia="华文中宋" w:hAnsi="华文中宋" w:hint="eastAsia"/>
-          <w:sz w:val="36"/>
-          <w:szCs w:val="36"/>
-        </w:rPr>
-        <w:t>业：</w:t>
+        <w:t>研究方向：</w:t>
       </w:r>
       <w:r>
         <w:rPr>
@@ -267,7 +332,7 @@
           <w:szCs w:val="36"/>
           <w:u w:val="single"/>
         </w:rPr>
-        <w:t xml:space="preserve">           </w:t>
+        <w:t xml:space="preserve">         </w:t>
       </w:r>
       <w:r>
         <w:rPr>
@@ -276,7 +341,7 @@
           <w:szCs w:val="36"/>
           <w:u w:val="single"/>
         </w:rPr>
-        <w:t>大气科学</w:t>
+        <w:t>大气物理与大气化学</w:t>
       </w:r>
       <w:r>
         <w:rPr>
@@ -285,7 +350,7 @@
           <w:szCs w:val="36"/>
           <w:u w:val="single"/>
         </w:rPr>
-        <w:t xml:space="preserve">   </w:t>
+        <w:t xml:space="preserve">     </w:t>
       </w:r>
     </w:p>
     <w:p>
@@ -297,6 +362,7 @@
           <w:rFonts w:ascii="华文中宋" w:eastAsia="华文中宋" w:hAnsi="华文中宋"/>
           <w:sz w:val="36"/>
           <w:szCs w:val="36"/>
+          <w:u w:val="single"/>
         </w:rPr>
       </w:pPr>
       <w:r>
@@ -305,7 +371,7 @@
           <w:sz w:val="36"/>
           <w:szCs w:val="36"/>
         </w:rPr>
-        <w:t>研究方向：</w:t>
+        <w:t>导师姓名：</w:t>
       </w:r>
       <w:r>
         <w:rPr>
@@ -332,7 +398,7 @@
           <w:szCs w:val="36"/>
           <w:u w:val="single"/>
         </w:rPr>
-        <w:t>大气物理与大气化学</w:t>
+        <w:t>陈辉林</w:t>
       </w:r>
       <w:r>
         <w:rPr>
@@ -347,63 +413,6 @@
     <w:p>
       <w:pPr>
         <w:spacing w:beforeLines="100" w:before="312" w:line="480" w:lineRule="auto"/>
-        <w:ind w:firstLineChars="425" w:firstLine="1530"/>
-        <w:jc w:val="left"/>
-        <w:rPr>
-          <w:rFonts w:ascii="华文中宋" w:eastAsia="华文中宋" w:hAnsi="华文中宋"/>
-          <w:sz w:val="36"/>
-          <w:szCs w:val="36"/>
-          <w:u w:val="single"/>
-        </w:rPr>
-      </w:pPr>
-      <w:r>
-        <w:rPr>
-          <w:rFonts w:ascii="华文中宋" w:eastAsia="华文中宋" w:hAnsi="华文中宋" w:hint="eastAsia"/>
-          <w:sz w:val="36"/>
-          <w:szCs w:val="36"/>
-        </w:rPr>
-        <w:t>导师姓名：</w:t>
-      </w:r>
-      <w:r>
-        <w:rPr>
-          <w:rFonts w:ascii="华文中宋" w:eastAsia="华文中宋" w:hAnsi="华文中宋" w:hint="eastAsia"/>
-          <w:sz w:val="36"/>
-          <w:szCs w:val="36"/>
-          <w:u w:val="single"/>
-        </w:rPr>
-        <w:t xml:space="preserve"> </w:t>
-      </w:r>
-      <w:r>
-        <w:rPr>
-          <w:rFonts w:ascii="华文中宋" w:eastAsia="华文中宋" w:hAnsi="华文中宋"/>
-          <w:sz w:val="36"/>
-          <w:szCs w:val="36"/>
-          <w:u w:val="single"/>
-        </w:rPr>
-        <w:t xml:space="preserve">         </w:t>
-      </w:r>
-      <w:r>
-        <w:rPr>
-          <w:rFonts w:ascii="华文中宋" w:eastAsia="华文中宋" w:hAnsi="华文中宋" w:hint="eastAsia"/>
-          <w:sz w:val="36"/>
-          <w:szCs w:val="36"/>
-          <w:u w:val="single"/>
-        </w:rPr>
-        <w:t>陈辉林</w:t>
-      </w:r>
-      <w:r>
-        <w:rPr>
-          <w:rFonts w:ascii="华文中宋" w:eastAsia="华文中宋" w:hAnsi="华文中宋"/>
-          <w:sz w:val="36"/>
-          <w:szCs w:val="36"/>
-          <w:u w:val="single"/>
-        </w:rPr>
-        <w:t xml:space="preserve">     </w:t>
-      </w:r>
-    </w:p>
-    <w:p>
-      <w:pPr>
-        <w:spacing w:beforeLines="100" w:before="312" w:line="480" w:lineRule="auto"/>
         <w:jc w:val="left"/>
         <w:rPr>
           <w:rFonts w:ascii="华文中宋" w:eastAsia="华文中宋" w:hAnsi="华文中宋"/>
@@ -492,7 +501,7 @@
           <w:szCs w:val="28"/>
           <w:u w:val="single"/>
         </w:rPr>
-        <w:t>06</w:t>
+        <w:t>0</w:t>
       </w:r>
       <w:r>
         <w:rPr>
@@ -501,15 +510,7 @@
           <w:szCs w:val="28"/>
           <w:u w:val="single"/>
         </w:rPr>
-        <w:t xml:space="preserve">     </w:t>
-      </w:r>
-      <w:r>
-        <w:rPr>
-          <w:rFonts w:ascii="Times New Roman" w:eastAsia="华文中宋" w:hAnsi="Times New Roman" w:cs="Times New Roman"/>
-          <w:sz w:val="28"/>
-          <w:szCs w:val="28"/>
-        </w:rPr>
-        <w:t>月</w:t>
+        <w:t>7</w:t>
       </w:r>
       <w:r>
         <w:rPr>
@@ -522,12 +523,20 @@
       </w:r>
       <w:r>
         <w:rPr>
+          <w:rFonts w:ascii="Times New Roman" w:eastAsia="华文中宋" w:hAnsi="Times New Roman" w:cs="Times New Roman"/>
+          <w:sz w:val="28"/>
+          <w:szCs w:val="28"/>
+        </w:rPr>
+        <w:t>月</w:t>
+      </w:r>
+      <w:r>
+        <w:rPr>
           <w:rFonts w:ascii="Times New Roman" w:eastAsia="华文中宋" w:hAnsi="Times New Roman" w:cs="Times New Roman" w:hint="eastAsia"/>
           <w:sz w:val="28"/>
           <w:szCs w:val="28"/>
           <w:u w:val="single"/>
         </w:rPr>
-        <w:t>30</w:t>
+        <w:t xml:space="preserve">     </w:t>
       </w:r>
       <w:r>
         <w:rPr>
@@ -536,7 +545,7 @@
           <w:szCs w:val="28"/>
           <w:u w:val="single"/>
         </w:rPr>
-        <w:t xml:space="preserve">  </w:t>
+        <w:t>02</w:t>
       </w:r>
       <w:r>
         <w:rPr>
@@ -545,13 +554,22 @@
           <w:szCs w:val="28"/>
           <w:u w:val="single"/>
         </w:rPr>
-        <w:t xml:space="preserve">   </w:t>
+        <w:t xml:space="preserve">  </w:t>
       </w:r>
       <w:r>
         <w:rPr>
           <w:rFonts w:ascii="Times New Roman" w:eastAsia="华文中宋" w:hAnsi="Times New Roman" w:cs="Times New Roman" w:hint="eastAsia"/>
           <w:sz w:val="28"/>
           <w:szCs w:val="28"/>
+          <w:u w:val="single"/>
+        </w:rPr>
+        <w:t xml:space="preserve">   </w:t>
+      </w:r>
+      <w:r>
+        <w:rPr>
+          <w:rFonts w:ascii="Times New Roman" w:eastAsia="华文中宋" w:hAnsi="Times New Roman" w:cs="Times New Roman" w:hint="eastAsia"/>
+          <w:sz w:val="28"/>
+          <w:szCs w:val="28"/>
         </w:rPr>
         <w:t>日</w:t>
       </w:r>
@@ -868,13 +886,8 @@
     </w:p>
     <w:p>
       <w:pPr>
-        <w:widowControl/>
-        <w:jc w:val="left"/>
-        <w:rPr>
-          <w:rFonts w:ascii="Times New Roman" w:eastAsia="华文中宋" w:hAnsi="Times New Roman" w:cs="Times New Roman"/>
-          <w:sz w:val="40"/>
-          <w:szCs w:val="36"/>
-        </w:rPr>
+        <w:keepNext/>
+        <w:spacing w:before="200" w:after="120"/>
       </w:pPr>
       <w:r>
         <w:rPr>
@@ -950,21 +963,7 @@
           <w:rFonts w:ascii="Times New Roman" w:eastAsia="宋体" w:hAnsi="Times New Roman"/>
           <w:sz w:val="24"/>
         </w:rPr>
-        <w:t>大气甲烷碳氢同位素季节循环振幅对羟基自由基</w:t>
-      </w:r>
-      <w:r>
-        <w:rPr>
-          <w:rFonts w:ascii="Times New Roman" w:eastAsia="宋体" w:hAnsi="Times New Roman"/>
-          <w:sz w:val="24"/>
-        </w:rPr>
-        <w:t xml:space="preserve"> ¹³C </w:t>
-      </w:r>
-      <w:r>
-        <w:rPr>
-          <w:rFonts w:ascii="Times New Roman" w:eastAsia="宋体" w:hAnsi="Times New Roman"/>
-          <w:sz w:val="24"/>
-        </w:rPr>
-        <w:t>动力学同位素效应的观测约束</w:t>
+        <w:t>基于甲烷同位素季节循环的大气羟基氧化碳同位素动力学分馏系数约束研究</w:t>
       </w:r>
     </w:p>
     <w:p>
@@ -985,7 +984,7 @@
           <w:rFonts w:ascii="Times New Roman" w:eastAsia="宋体" w:hAnsi="Times New Roman"/>
           <w:sz w:val="24"/>
         </w:rPr>
-        <w:t xml:space="preserve"> Constraining the OH ¹³C Kinetic Isotope Effect from the Seasonal Cycle Amplitude of Atmospheric Methane Carbon and Hydrogen Isotopes</w:t>
+        <w:t xml:space="preserve"> Constraining the Carbon Isotope Kinetic Fractionation of Atmospheric Methane Oxidation by the Hydroxyl Radical from the Seasonal Cycle of Methane Isotopes</w:t>
       </w:r>
     </w:p>
     <w:p>
@@ -1574,7 +1573,15 @@
           <w:rFonts w:ascii="Times New Roman" w:eastAsia="宋体" w:hAnsi="Times New Roman"/>
           <w:sz w:val="24"/>
         </w:rPr>
-        <w:t>的首个基于季节相量的大气观测约束区间，评估其能否区分两个实验室值，并讨论对全球甲烷源分配的意义。</w:t>
+        <w:t>的首个基于季</w:t>
+      </w:r>
+      <w:r>
+        <w:rPr>
+          <w:rFonts w:ascii="Times New Roman" w:eastAsia="宋体" w:hAnsi="Times New Roman"/>
+          <w:sz w:val="24"/>
+        </w:rPr>
+        <w:lastRenderedPageBreak/>
+        <w:t>节相量的大气观测约束区间，评估其能否区分两个实验室值，并讨论对全球甲烷源分配的意义。</w:t>
       </w:r>
     </w:p>
     <w:p>
@@ -1588,7 +1595,6 @@
           <w:b/>
           <w:sz w:val="24"/>
         </w:rPr>
-        <w:lastRenderedPageBreak/>
         <w:t>关键词：</w:t>
       </w:r>
       <w:r>
@@ -1631,7 +1637,15 @@
           <w:rFonts w:ascii="Times New Roman" w:eastAsia="宋体" w:hAnsi="Times New Roman"/>
           <w:sz w:val="24"/>
         </w:rPr>
-        <w:t>Methane (CH₄) is the second most important anthropogenic greenhouse gas, and the stable carbon and hydrogen isotopic composition of atmospheric methane (δ¹³C-CH₄, δD-CH₄) is widely used to partition methane sources (fossil fuel, microbial, biomass burning) and sinks. However, isotope-based source–sink inversions are highly sensitive to the carbon kinetic isotope effect (KIE) of methane oxidation by the hydroxyl radical (OH), denoted α¹³C_OH, which remains contested between the laboratory determinations of Cantrell et al. (1990, 1.0054) and Saueressig et al. (2001, 1.0039). This ~1.5‰ discrepancy reallocates roughly 13–20 Tg yr⁻¹ between fossil and microbial sources. Two decades of laboratory measurements have not converged, and an atmospheric observation independent of laboratory conditions can provide a new constraint. The core idea is that OH has a strong seasonal cycle (summer maximum); preferential destruction of the light isotopologue enriches residual methane in both ¹³C and D, so that if OH dominates the seasonal cycle, the ratio of co-located seasonal amplitudes A(δ¹³C)/A(δD) approximates the KIE ratio (α¹³C−1)/(α_D−1). Because the OH D-KIE (α_D_OH≈1.294) is comparatively well constrained, it can serve as a hydrogen reference to infer the disputed α¹³C_OH. The study proceeds in two stages: (1) establish a reproducible pipeline to extract the seasonal cycle amplitude (SCA) of δ¹³C-CH₄ from NOAA/INSTAAR flask data, characterize its spatiotemporal distribution and long-/recent-term trends, and provide an initial exploration of the carbon-isotope seasonal cycle signal; (2) extend the method to co-located δD-CH₄ observations, represent annual harmonics as complex phasors (B+iC), subtract wetland source seasonality as a vector, and invert the corrected amplitude ratio for α¹³C_OH. The expected outcome is the first phasor-based atmospheric constraint on α¹³C_OH, an assessment of whether observations can discriminate the two laboratory values, and a discussion of implications for the global methane source budget.</w:t>
+        <w:t xml:space="preserve">Methane (CH₄) is the second most important anthropogenic greenhouse gas, and the stable carbon and hydrogen isotopic composition of atmospheric methane (δ¹³C-CH₄, δD-CH₄) is widely used to partition methane sources (fossil fuel, microbial, biomass burning) and sinks. However, isotope-based source–sink inversions are highly sensitive to the carbon kinetic isotope effect (KIE) of methane oxidation by the hydroxyl radical (OH), denoted α¹³C_OH, which remains contested between the laboratory determinations of Cantrell et al. (1990, 1.0054) and Saueressig et al. (2001, 1.0039). This ~1.5‰ discrepancy reallocates roughly 13–20 Tg yr⁻¹ between fossil and microbial sources. Two decades of laboratory measurements have not converged, and an atmospheric observation independent of laboratory conditions can provide a new constraint. The core idea is that OH has a strong seasonal cycle (summer maximum); preferential destruction of the light isotopologue enriches residual methane in both ¹³C and D, so that if OH dominates the seasonal cycle, the ratio of co-located seasonal amplitudes A(δ¹³C)/A(δD) approximates the KIE ratio (α¹³C−1)/(α_D−1). Because the OH D-KIE (α_D_OH≈1.294) is comparatively well constrained, it can serve as a hydrogen reference to infer the disputed α¹³C_OH. The study proceeds in two stages: (1) establish a reproducible pipeline to extract the seasonal cycle amplitude (SCA) of δ¹³C-CH₄ from NOAA/INSTAAR flask data, characterize its spatiotemporal distribution and long-/recent-term trends, and provide an initial exploration of the carbon-isotope seasonal cycle signal; (2) extend the method to co-located δD-CH₄ observations, represent annual harmonics as complex phasors (B+iC), subtract wetland source seasonality as a vector, and invert the corrected amplitude ratio for α¹³C_OH. The expected outcome is the first phasor-based atmospheric constraint on α¹³C_OH, an assessment of whether observations can discriminate the two laboratory values, and a </w:t>
+      </w:r>
+      <w:r>
+        <w:rPr>
+          <w:rFonts w:ascii="Times New Roman" w:eastAsia="宋体" w:hAnsi="Times New Roman"/>
+          <w:sz w:val="24"/>
+        </w:rPr>
+        <w:lastRenderedPageBreak/>
+        <w:t>discussion of implications for the global methane source budget.</w:t>
       </w:r>
     </w:p>
     <w:p>
@@ -1652,15 +1666,7 @@
           <w:rFonts w:ascii="Times New Roman" w:eastAsia="宋体" w:hAnsi="Times New Roman"/>
           <w:sz w:val="24"/>
         </w:rPr>
-        <w:t xml:space="preserve"> atmospheric methane; stable C and H isotopes; seasonal cycle </w:t>
-      </w:r>
-      <w:r>
-        <w:rPr>
-          <w:rFonts w:ascii="Times New Roman" w:eastAsia="宋体" w:hAnsi="Times New Roman"/>
-          <w:sz w:val="24"/>
-        </w:rPr>
-        <w:lastRenderedPageBreak/>
-        <w:t>amplitude; kinetic isotope effect; hydroxyl radical; phasor decomposition</w:t>
+        <w:t xml:space="preserve"> atmospheric methane; stable C and H isotopes; seasonal cycle amplitude; kinetic isotope effect; hydroxyl radical; phasor decomposition</w:t>
       </w:r>
     </w:p>
     <w:p>
@@ -2219,6 +2225,14 @@
       <w:r>
         <w:rPr>
           <w:rFonts w:ascii="Times New Roman" w:eastAsia="宋体" w:hAnsi="Times New Roman"/>
+          <w:sz w:val="24"/>
+        </w:rPr>
+        <w:lastRenderedPageBreak/>
+        <w:t xml:space="preserve"> </w:t>
+      </w:r>
+      <w:r>
+        <w:rPr>
+          <w:rFonts w:ascii="Times New Roman" w:eastAsia="宋体" w:hAnsi="Times New Roman"/>
           <w:b/>
           <w:sz w:val="24"/>
         </w:rPr>
@@ -2283,7 +2297,6 @@
           <w:rFonts w:ascii="Times New Roman" w:eastAsia="宋体" w:hAnsi="Times New Roman"/>
           <w:sz w:val="24"/>
         </w:rPr>
-        <w:lastRenderedPageBreak/>
         <w:t>围绕这一总问题，进一步分解为三个子问题：</w:t>
       </w:r>
     </w:p>
@@ -2822,6 +2835,7 @@
           <w:color w:val="000000"/>
           <w:sz w:val="28"/>
         </w:rPr>
+        <w:lastRenderedPageBreak/>
         <w:t>三、国内外研究现状</w:t>
       </w:r>
     </w:p>
@@ -2943,15 +2957,7 @@
           <w:rFonts w:ascii="Times New Roman" w:eastAsia="宋体" w:hAnsi="Times New Roman"/>
           <w:sz w:val="24"/>
         </w:rPr>
-        <w:t>）系统建立了细菌成因甲烷的</w:t>
-      </w:r>
-      <w:r>
-        <w:rPr>
-          <w:rFonts w:ascii="Times New Roman" w:eastAsia="宋体" w:hAnsi="Times New Roman"/>
-          <w:sz w:val="24"/>
-        </w:rPr>
-        <w:lastRenderedPageBreak/>
-        <w:t>碳氢同位素判别框架；</w:t>
+        <w:t>）系统建立了细菌成因甲烷的碳氢同位素判别框架；</w:t>
       </w:r>
       <w:r>
         <w:rPr>
@@ -3876,7 +3882,15 @@
           <w:rFonts w:ascii="Times New Roman" w:eastAsia="宋体" w:hAnsi="Times New Roman"/>
           <w:sz w:val="24"/>
         </w:rPr>
-        <w:t>的参数集基本一致）。因此观测到的季节分馏反映的是</w:t>
+        <w:t>的参数集基本一致）。</w:t>
+      </w:r>
+      <w:r>
+        <w:rPr>
+          <w:rFonts w:ascii="Times New Roman" w:eastAsia="宋体" w:hAnsi="Times New Roman"/>
+          <w:sz w:val="24"/>
+        </w:rPr>
+        <w:lastRenderedPageBreak/>
+        <w:t>因此观测到的季节分馏反映的是</w:t>
       </w:r>
       <w:r>
         <w:rPr>
@@ -3987,15 +4001,7 @@
           <w:rFonts w:ascii="Times New Roman" w:eastAsia="宋体" w:hAnsi="Times New Roman"/>
           <w:sz w:val="24"/>
         </w:rPr>
-        <w:t>浓度具有显著的季节性，夏季因强日照与高水汽而达到峰值，年际变</w:t>
-      </w:r>
-      <w:r>
-        <w:rPr>
-          <w:rFonts w:ascii="Times New Roman" w:eastAsia="宋体" w:hAnsi="Times New Roman"/>
-          <w:sz w:val="24"/>
-        </w:rPr>
-        <w:lastRenderedPageBreak/>
-        <w:t>率则较小（</w:t>
+        <w:t>浓度具有显著的季节性，夏季因强日照与高水汽而达到峰值，年际变率则较小（</w:t>
       </w:r>
       <w:r>
         <w:rPr>
@@ -4718,6 +4724,7 @@
           <w:color w:val="000000"/>
           <w:sz w:val="26"/>
         </w:rPr>
+        <w:lastRenderedPageBreak/>
         <w:t xml:space="preserve">3.7 </w:t>
       </w:r>
       <w:r>
@@ -4810,15 +4817,7 @@
           <w:rFonts w:ascii="Times New Roman" w:eastAsia="宋体" w:hAnsi="Times New Roman"/>
           <w:sz w:val="24"/>
         </w:rPr>
-        <w:t>）为半球间交换</w:t>
-      </w:r>
-      <w:r>
-        <w:rPr>
-          <w:rFonts w:ascii="Times New Roman" w:eastAsia="宋体" w:hAnsi="Times New Roman"/>
-          <w:sz w:val="24"/>
-        </w:rPr>
-        <w:lastRenderedPageBreak/>
-        <w:t>时间提供了观测依据。</w:t>
+        <w:t>）为半球间交换时间提供了观测依据。</w:t>
       </w:r>
     </w:p>
     <w:p>
@@ -5302,6 +5301,7 @@
           <w:color w:val="000000"/>
           <w:sz w:val="26"/>
         </w:rPr>
+        <w:lastRenderedPageBreak/>
         <w:t xml:space="preserve">4.2 </w:t>
       </w:r>
       <w:r>
@@ -5325,23 +5325,7 @@
           <w:b/>
           <w:sz w:val="24"/>
         </w:rPr>
-        <w:t>内容一：甲烷碳同位素季节振幅的时空特征与趋势（对应</w:t>
-      </w:r>
-      <w:r>
-        <w:rPr>
-          <w:rFonts w:ascii="Times New Roman" w:eastAsia="宋体" w:hAnsi="Times New Roman"/>
-          <w:b/>
-          <w:sz w:val="24"/>
-        </w:rPr>
-        <w:t xml:space="preserve"> SCA </w:t>
-      </w:r>
-      <w:r>
-        <w:rPr>
-          <w:rFonts w:ascii="Times New Roman" w:eastAsia="宋体" w:hAnsi="Times New Roman"/>
-          <w:b/>
-          <w:sz w:val="24"/>
-        </w:rPr>
-        <w:t>实验，方法支撑层）</w:t>
+        <w:t>内容一：甲烷碳同位素季节振幅的时空特征与趋势</w:t>
       </w:r>
     </w:p>
     <w:p>
@@ -5403,15 +5387,7 @@
           <w:rFonts w:ascii="Times New Roman" w:eastAsia="宋体" w:hAnsi="Times New Roman"/>
           <w:sz w:val="24"/>
         </w:rPr>
-        <w:t xml:space="preserve"> </w:t>
-      </w:r>
-      <w:r>
-        <w:rPr>
-          <w:rFonts w:ascii="Times New Roman" w:eastAsia="宋体" w:hAnsi="Times New Roman"/>
-          <w:sz w:val="24"/>
-        </w:rPr>
-        <w:lastRenderedPageBreak/>
-        <w:t xml:space="preserve">4600 </w:t>
+        <w:t xml:space="preserve"> 4600 </w:t>
       </w:r>
       <w:r>
         <w:rPr>
@@ -5572,23 +5548,7 @@
           <w:b/>
           <w:sz w:val="24"/>
         </w:rPr>
-        <w:t>内容二：双同位素季节谐波的相量表征（对应</w:t>
-      </w:r>
-      <w:r>
-        <w:rPr>
-          <w:rFonts w:ascii="Times New Roman" w:eastAsia="宋体" w:hAnsi="Times New Roman"/>
-          <w:b/>
-          <w:sz w:val="24"/>
-        </w:rPr>
-        <w:t xml:space="preserve"> KIE_sites </w:t>
-      </w:r>
-      <w:r>
-        <w:rPr>
-          <w:rFonts w:ascii="Times New Roman" w:eastAsia="宋体" w:hAnsi="Times New Roman"/>
-          <w:b/>
-          <w:sz w:val="24"/>
-        </w:rPr>
-        <w:t>实验）</w:t>
+        <w:t>内容二：双同位素季节谐波的相量表征</w:t>
       </w:r>
     </w:p>
     <w:p>
@@ -5996,23 +5956,7 @@
           <w:b/>
           <w:sz w:val="24"/>
         </w:rPr>
-        <w:t>反演与影响评估（对应</w:t>
-      </w:r>
-      <w:r>
-        <w:rPr>
-          <w:rFonts w:ascii="Times New Roman" w:eastAsia="宋体" w:hAnsi="Times New Roman"/>
-          <w:b/>
-          <w:sz w:val="24"/>
-        </w:rPr>
-        <w:t xml:space="preserve"> KIE_sites </w:t>
-      </w:r>
-      <w:r>
-        <w:rPr>
-          <w:rFonts w:ascii="Times New Roman" w:eastAsia="宋体" w:hAnsi="Times New Roman"/>
-          <w:b/>
-          <w:sz w:val="24"/>
-        </w:rPr>
-        <w:t>实验）</w:t>
+        <w:t>反演与影响评估</w:t>
       </w:r>
     </w:p>
     <w:p>
@@ -6306,6 +6250,7 @@
           <w:color w:val="000000"/>
           <w:sz w:val="26"/>
         </w:rPr>
+        <w:lastRenderedPageBreak/>
         <w:t xml:space="preserve">4.3 </w:t>
       </w:r>
       <w:r>
@@ -6439,15 +6384,7 @@
           <w:rFonts w:ascii="Times New Roman" w:eastAsia="宋体" w:hAnsi="Times New Roman"/>
           <w:sz w:val="24"/>
         </w:rPr>
-        <w:t>同相位但反方向的湿</w:t>
-      </w:r>
-      <w:r>
-        <w:rPr>
-          <w:rFonts w:ascii="Times New Roman" w:eastAsia="宋体" w:hAnsi="Times New Roman"/>
-          <w:sz w:val="24"/>
-        </w:rPr>
-        <w:lastRenderedPageBreak/>
-        <w:t>地源季节性，避免标量相减引入的相位误差。</w:t>
+        <w:t>同相位但反方向的湿地源季节性，避免标量相减引入的相位误差。</w:t>
       </w:r>
     </w:p>
     <w:p>
@@ -7341,6 +7278,7 @@
           <w:rFonts w:ascii="Times New Roman" w:eastAsia="宋体" w:hAnsi="Times New Roman"/>
           <w:sz w:val="24"/>
         </w:rPr>
+        <w:lastRenderedPageBreak/>
         <w:t xml:space="preserve">6. </w:t>
       </w:r>
       <w:r>
@@ -7551,15 +7489,7 @@
           <w:rFonts w:ascii="Times New Roman" w:eastAsia="宋体" w:hAnsi="Times New Roman"/>
           <w:sz w:val="24"/>
         </w:rPr>
-        <w:t xml:space="preserve">Saueressig et </w:t>
-      </w:r>
-      <w:r>
-        <w:rPr>
-          <w:rFonts w:ascii="Times New Roman" w:eastAsia="宋体" w:hAnsi="Times New Roman"/>
-          <w:sz w:val="24"/>
-        </w:rPr>
-        <w:lastRenderedPageBreak/>
-        <w:t>al., 2001</w:t>
+        <w:t>Saueressig et al., 2001</w:t>
       </w:r>
       <w:r>
         <w:rPr>
@@ -7758,7 +7688,7 @@
           <w:rFonts w:ascii="Times New Roman" w:eastAsia="宋体" w:hAnsi="Times New Roman"/>
           <w:sz w:val="24"/>
         </w:rPr>
-        <w:t>的数据产品，且已完成下载与本地化整理；</w:t>
+        <w:t>的权威数据产品，且已完成下载与本地化整理；</w:t>
       </w:r>
       <w:r>
         <w:rPr>
@@ -8372,6 +8302,7 @@
           <w:rFonts w:ascii="Times New Roman" w:eastAsia="宋体" w:hAnsi="Times New Roman"/>
           <w:sz w:val="24"/>
         </w:rPr>
+        <w:lastRenderedPageBreak/>
         <w:t xml:space="preserve">1. </w:t>
       </w:r>
       <w:r>
@@ -8562,15 +8493,7 @@
           <w:rFonts w:ascii="Times New Roman" w:eastAsia="宋体" w:hAnsi="Times New Roman"/>
           <w:sz w:val="24"/>
         </w:rPr>
-        <w:t>多时段趋势及方法敏感性分析，</w:t>
-      </w:r>
-      <w:r>
-        <w:rPr>
-          <w:rFonts w:ascii="Times New Roman" w:eastAsia="宋体" w:hAnsi="Times New Roman"/>
-          <w:sz w:val="24"/>
-        </w:rPr>
-        <w:lastRenderedPageBreak/>
-        <w:t>产出站点</w:t>
+        <w:t>多时段趋势及方法敏感性分析，产出站点</w:t>
       </w:r>
       <w:r>
         <w:rPr>
@@ -8939,7 +8862,633 @@
           <w:rFonts w:ascii="Times New Roman" w:eastAsia="宋体" w:hAnsi="Times New Roman"/>
           <w:sz w:val="24"/>
         </w:rPr>
-        <w:t>上述基础表明，本研究的数据、方法与初步结论均已具备，开题后的主要工作是在统一的论文框架下系统化、严格化并补强北半球残余偏差的处理与不确定性论证。</w:t>
+        <w:t>在上述工作基础上，本研究已可提出如下</w:t>
+      </w:r>
+      <w:r>
+        <w:rPr>
+          <w:rFonts w:ascii="Times New Roman" w:eastAsia="宋体" w:hAnsi="Times New Roman"/>
+          <w:b/>
+          <w:sz w:val="24"/>
+        </w:rPr>
+        <w:t>初步结论</w:t>
+      </w:r>
+      <w:r>
+        <w:rPr>
+          <w:rFonts w:ascii="Times New Roman" w:eastAsia="宋体" w:hAnsi="Times New Roman"/>
+          <w:sz w:val="24"/>
+        </w:rPr>
+        <w:t>（正式结论待论文全面完成后给出）：</w:t>
+      </w:r>
+    </w:p>
+    <w:p>
+      <w:pPr>
+        <w:spacing w:after="80" w:line="360" w:lineRule="auto"/>
+      </w:pPr>
+      <w:r>
+        <w:rPr>
+          <w:rFonts w:ascii="Times New Roman" w:eastAsia="宋体" w:hAnsi="Times New Roman"/>
+          <w:sz w:val="24"/>
+        </w:rPr>
+        <w:t xml:space="preserve">1. </w:t>
+      </w:r>
+      <w:r>
+        <w:rPr>
+          <w:rFonts w:ascii="Times New Roman" w:eastAsia="宋体" w:hAnsi="Times New Roman"/>
+          <w:b/>
+          <w:sz w:val="24"/>
+        </w:rPr>
+        <w:t>季节循环可作为</w:t>
+      </w:r>
+      <w:r>
+        <w:rPr>
+          <w:rFonts w:ascii="Times New Roman" w:eastAsia="宋体" w:hAnsi="Times New Roman"/>
+          <w:b/>
+          <w:sz w:val="24"/>
+        </w:rPr>
+        <w:t xml:space="preserve"> OH </w:t>
+      </w:r>
+      <w:r>
+        <w:rPr>
+          <w:rFonts w:ascii="Times New Roman" w:eastAsia="宋体" w:hAnsi="Times New Roman"/>
+          <w:b/>
+          <w:sz w:val="24"/>
+        </w:rPr>
+        <w:t>碳</w:t>
+      </w:r>
+      <w:r>
+        <w:rPr>
+          <w:rFonts w:ascii="Times New Roman" w:eastAsia="宋体" w:hAnsi="Times New Roman"/>
+          <w:b/>
+          <w:sz w:val="24"/>
+        </w:rPr>
+        <w:t xml:space="preserve"> KIE </w:t>
+      </w:r>
+      <w:r>
+        <w:rPr>
+          <w:rFonts w:ascii="Times New Roman" w:eastAsia="宋体" w:hAnsi="Times New Roman"/>
+          <w:b/>
+          <w:sz w:val="24"/>
+        </w:rPr>
+        <w:t>的大气观测约束。</w:t>
+      </w:r>
+      <w:r>
+        <w:rPr>
+          <w:rFonts w:ascii="Times New Roman" w:eastAsia="宋体" w:hAnsi="Times New Roman"/>
+          <w:sz w:val="24"/>
+        </w:rPr>
+        <w:t xml:space="preserve"> </w:t>
+      </w:r>
+      <w:r>
+        <w:rPr>
+          <w:rFonts w:ascii="Times New Roman" w:eastAsia="宋体" w:hAnsi="Times New Roman"/>
+          <w:sz w:val="24"/>
+        </w:rPr>
+        <w:t>将共址碳、氢同位素年谐波表示为复相量并对湿地源作矢量校正后，南半球洁净站点（</w:t>
+      </w:r>
+      <w:r>
+        <w:rPr>
+          <w:rFonts w:ascii="Times New Roman" w:eastAsia="宋体" w:hAnsi="Times New Roman"/>
+          <w:sz w:val="24"/>
+        </w:rPr>
+        <w:t>Cape Grim</w:t>
+      </w:r>
+      <w:r>
+        <w:rPr>
+          <w:rFonts w:ascii="Times New Roman" w:eastAsia="宋体" w:hAnsi="Times New Roman"/>
+          <w:sz w:val="24"/>
+        </w:rPr>
+        <w:t>、</w:t>
+      </w:r>
+      <w:r>
+        <w:rPr>
+          <w:rFonts w:ascii="Times New Roman" w:eastAsia="宋体" w:hAnsi="Times New Roman"/>
+          <w:sz w:val="24"/>
+        </w:rPr>
+        <w:t>South Pole</w:t>
+      </w:r>
+      <w:r>
+        <w:rPr>
+          <w:rFonts w:ascii="Times New Roman" w:eastAsia="宋体" w:hAnsi="Times New Roman"/>
+          <w:sz w:val="24"/>
+        </w:rPr>
+        <w:t>）给出</w:t>
+      </w:r>
+      <w:r>
+        <w:rPr>
+          <w:rFonts w:ascii="Times New Roman" w:eastAsia="宋体" w:hAnsi="Times New Roman"/>
+          <w:sz w:val="24"/>
+        </w:rPr>
+        <w:t xml:space="preserve"> α¹³C_OH ≈ 1.0044</w:t>
+      </w:r>
+      <w:r>
+        <w:rPr>
+          <w:rFonts w:ascii="Times New Roman" w:eastAsia="宋体" w:hAnsi="Times New Roman"/>
+          <w:sz w:val="24"/>
+        </w:rPr>
+        <w:t>（</w:t>
+      </w:r>
+      <w:r>
+        <w:rPr>
+          <w:rFonts w:ascii="Times New Roman" w:eastAsia="宋体" w:hAnsi="Times New Roman"/>
+          <w:sz w:val="24"/>
+        </w:rPr>
+        <w:t xml:space="preserve">95% </w:t>
+      </w:r>
+      <w:r>
+        <w:rPr>
+          <w:rFonts w:ascii="Times New Roman" w:eastAsia="宋体" w:hAnsi="Times New Roman"/>
+          <w:sz w:val="24"/>
+        </w:rPr>
+        <w:t>区间约</w:t>
+      </w:r>
+      <w:r>
+        <w:rPr>
+          <w:rFonts w:ascii="Times New Roman" w:eastAsia="宋体" w:hAnsi="Times New Roman"/>
+          <w:sz w:val="24"/>
+        </w:rPr>
+        <w:t xml:space="preserve"> [0.997, 1.015]</w:t>
+      </w:r>
+      <w:r>
+        <w:rPr>
+          <w:rFonts w:ascii="Times New Roman" w:eastAsia="宋体" w:hAnsi="Times New Roman"/>
+          <w:sz w:val="24"/>
+        </w:rPr>
+        <w:t>），与</w:t>
+      </w:r>
+      <w:r>
+        <w:rPr>
+          <w:rFonts w:ascii="Times New Roman" w:eastAsia="宋体" w:hAnsi="Times New Roman"/>
+          <w:sz w:val="24"/>
+        </w:rPr>
+        <w:t xml:space="preserve"> Saueressig</w:t>
+      </w:r>
+      <w:r>
+        <w:rPr>
+          <w:rFonts w:ascii="Times New Roman" w:eastAsia="宋体" w:hAnsi="Times New Roman"/>
+          <w:sz w:val="24"/>
+        </w:rPr>
+        <w:t>（</w:t>
+      </w:r>
+      <w:r>
+        <w:rPr>
+          <w:rFonts w:ascii="Times New Roman" w:eastAsia="宋体" w:hAnsi="Times New Roman"/>
+          <w:sz w:val="24"/>
+        </w:rPr>
+        <w:t>1.0039</w:t>
+      </w:r>
+      <w:r>
+        <w:rPr>
+          <w:rFonts w:ascii="Times New Roman" w:eastAsia="宋体" w:hAnsi="Times New Roman"/>
+          <w:sz w:val="24"/>
+        </w:rPr>
+        <w:t>）接近、与</w:t>
+      </w:r>
+      <w:r>
+        <w:rPr>
+          <w:rFonts w:ascii="Times New Roman" w:eastAsia="宋体" w:hAnsi="Times New Roman"/>
+          <w:sz w:val="24"/>
+        </w:rPr>
+        <w:t xml:space="preserve"> Cantrell</w:t>
+      </w:r>
+      <w:r>
+        <w:rPr>
+          <w:rFonts w:ascii="Times New Roman" w:eastAsia="宋体" w:hAnsi="Times New Roman"/>
+          <w:sz w:val="24"/>
+        </w:rPr>
+        <w:t>（</w:t>
+      </w:r>
+      <w:r>
+        <w:rPr>
+          <w:rFonts w:ascii="Times New Roman" w:eastAsia="宋体" w:hAnsi="Times New Roman"/>
+          <w:sz w:val="24"/>
+        </w:rPr>
+        <w:t>1.0054</w:t>
+      </w:r>
+      <w:r>
+        <w:rPr>
+          <w:rFonts w:ascii="Times New Roman" w:eastAsia="宋体" w:hAnsi="Times New Roman"/>
+          <w:sz w:val="24"/>
+        </w:rPr>
+        <w:t>）在不确定度内一致。这表明本方法能给出量级合理、可与实验室值直接比较的独立约束，初步回答了核心科学问题。</w:t>
+      </w:r>
+    </w:p>
+    <w:p>
+      <w:pPr>
+        <w:spacing w:after="80" w:line="360" w:lineRule="auto"/>
+      </w:pPr>
+      <w:r>
+        <w:rPr>
+          <w:rFonts w:ascii="Times New Roman" w:eastAsia="宋体" w:hAnsi="Times New Roman"/>
+          <w:sz w:val="24"/>
+        </w:rPr>
+        <w:t xml:space="preserve">2. </w:t>
+      </w:r>
+      <w:r>
+        <w:rPr>
+          <w:rFonts w:ascii="Times New Roman" w:eastAsia="宋体" w:hAnsi="Times New Roman"/>
+          <w:b/>
+          <w:sz w:val="24"/>
+        </w:rPr>
+        <w:t>源季节性对振幅比的污染真实存在且可诊断、可校正。</w:t>
+      </w:r>
+      <w:r>
+        <w:rPr>
+          <w:rFonts w:ascii="Times New Roman" w:eastAsia="宋体" w:hAnsi="Times New Roman"/>
+          <w:sz w:val="24"/>
+        </w:rPr>
+        <w:t xml:space="preserve"> </w:t>
+      </w:r>
+      <w:r>
+        <w:rPr>
+          <w:rFonts w:ascii="Times New Roman" w:eastAsia="宋体" w:hAnsi="Times New Roman"/>
+          <w:sz w:val="24"/>
+        </w:rPr>
+        <w:t>北半球站点的原始振幅比</w:t>
+      </w:r>
+      <w:r>
+        <w:rPr>
+          <w:rFonts w:ascii="Times New Roman" w:eastAsia="宋体" w:hAnsi="Times New Roman"/>
+          <w:sz w:val="24"/>
+        </w:rPr>
+        <w:t xml:space="preserve"> A(δ¹³C)/A(δD) </w:t>
+      </w:r>
+      <w:r>
+        <w:rPr>
+          <w:rFonts w:ascii="Times New Roman" w:eastAsia="宋体" w:hAnsi="Times New Roman"/>
+          <w:sz w:val="24"/>
+        </w:rPr>
+        <w:t>达纯</w:t>
+      </w:r>
+      <w:r>
+        <w:rPr>
+          <w:rFonts w:ascii="Times New Roman" w:eastAsia="宋体" w:hAnsi="Times New Roman"/>
+          <w:sz w:val="24"/>
+        </w:rPr>
+        <w:t xml:space="preserve"> OH </w:t>
+      </w:r>
+      <w:r>
+        <w:rPr>
+          <w:rFonts w:ascii="Times New Roman" w:eastAsia="宋体" w:hAnsi="Times New Roman"/>
+          <w:sz w:val="24"/>
+        </w:rPr>
+        <w:t>预期（约</w:t>
+      </w:r>
+      <w:r>
+        <w:rPr>
+          <w:rFonts w:ascii="Times New Roman" w:eastAsia="宋体" w:hAnsi="Times New Roman"/>
+          <w:sz w:val="24"/>
+        </w:rPr>
+        <w:t xml:space="preserve"> 0.013–0.017</w:t>
+      </w:r>
+      <w:r>
+        <w:rPr>
+          <w:rFonts w:ascii="Times New Roman" w:eastAsia="宋体" w:hAnsi="Times New Roman"/>
+          <w:sz w:val="24"/>
+        </w:rPr>
+        <w:t>）的</w:t>
+      </w:r>
+      <w:r>
+        <w:rPr>
+          <w:rFonts w:ascii="Times New Roman" w:eastAsia="宋体" w:hAnsi="Times New Roman"/>
+          <w:sz w:val="24"/>
+        </w:rPr>
+        <w:t xml:space="preserve"> 3–10 </w:t>
+      </w:r>
+      <w:r>
+        <w:rPr>
+          <w:rFonts w:ascii="Times New Roman" w:eastAsia="宋体" w:hAnsi="Times New Roman"/>
+          <w:sz w:val="24"/>
+        </w:rPr>
+        <w:t>倍，经湿地相量矢量校正后显著下降（例如</w:t>
+      </w:r>
+      <w:r>
+        <w:rPr>
+          <w:rFonts w:ascii="Times New Roman" w:eastAsia="宋体" w:hAnsi="Times New Roman"/>
+          <w:sz w:val="24"/>
+        </w:rPr>
+        <w:t xml:space="preserve"> BRW </w:t>
+      </w:r>
+      <w:r>
+        <w:rPr>
+          <w:rFonts w:ascii="Times New Roman" w:eastAsia="宋体" w:hAnsi="Times New Roman"/>
+          <w:sz w:val="24"/>
+        </w:rPr>
+        <w:t>由</w:t>
+      </w:r>
+      <w:r>
+        <w:rPr>
+          <w:rFonts w:ascii="Times New Roman" w:eastAsia="宋体" w:hAnsi="Times New Roman"/>
+          <w:sz w:val="24"/>
+        </w:rPr>
+        <w:t xml:space="preserve"> 0.139 </w:t>
+      </w:r>
+      <w:r>
+        <w:rPr>
+          <w:rFonts w:ascii="Times New Roman" w:eastAsia="宋体" w:hAnsi="Times New Roman"/>
+          <w:sz w:val="24"/>
+        </w:rPr>
+        <w:t>降至</w:t>
+      </w:r>
+      <w:r>
+        <w:rPr>
+          <w:rFonts w:ascii="Times New Roman" w:eastAsia="宋体" w:hAnsi="Times New Roman"/>
+          <w:sz w:val="24"/>
+        </w:rPr>
+        <w:t xml:space="preserve"> 0.056</w:t>
+      </w:r>
+      <w:r>
+        <w:rPr>
+          <w:rFonts w:ascii="Times New Roman" w:eastAsia="宋体" w:hAnsi="Times New Roman"/>
+          <w:sz w:val="24"/>
+        </w:rPr>
+        <w:t>）；校正后各站碳、氢</w:t>
+      </w:r>
+      <w:r>
+        <w:rPr>
+          <w:rFonts w:ascii="Times New Roman" w:eastAsia="宋体" w:hAnsi="Times New Roman"/>
+          <w:sz w:val="24"/>
+        </w:rPr>
+        <w:t>"</w:t>
+      </w:r>
+      <w:r>
+        <w:rPr>
+          <w:rFonts w:ascii="Times New Roman" w:eastAsia="宋体" w:hAnsi="Times New Roman"/>
+          <w:sz w:val="24"/>
+        </w:rPr>
+        <w:t>汇相</w:t>
+      </w:r>
+      <w:r>
+        <w:rPr>
+          <w:rFonts w:ascii="Times New Roman" w:eastAsia="宋体" w:hAnsi="Times New Roman"/>
+          <w:sz w:val="24"/>
+        </w:rPr>
+        <w:lastRenderedPageBreak/>
+        <w:t>位</w:t>
+      </w:r>
+      <w:r>
+        <w:rPr>
+          <w:rFonts w:ascii="Times New Roman" w:eastAsia="宋体" w:hAnsi="Times New Roman"/>
+          <w:sz w:val="24"/>
+        </w:rPr>
+        <w:t>"</w:t>
+      </w:r>
+      <w:r>
+        <w:rPr>
+          <w:rFonts w:ascii="Times New Roman" w:eastAsia="宋体" w:hAnsi="Times New Roman"/>
+          <w:sz w:val="24"/>
+        </w:rPr>
+        <w:t>一致到</w:t>
+      </w:r>
+      <w:r>
+        <w:rPr>
+          <w:rFonts w:ascii="Times New Roman" w:eastAsia="宋体" w:hAnsi="Times New Roman"/>
+          <w:sz w:val="24"/>
+        </w:rPr>
+        <w:t xml:space="preserve"> 1 </w:t>
+      </w:r>
+      <w:r>
+        <w:rPr>
+          <w:rFonts w:ascii="Times New Roman" w:eastAsia="宋体" w:hAnsi="Times New Roman"/>
+          <w:sz w:val="24"/>
+        </w:rPr>
+        <w:t>个月以内，支持共同的</w:t>
+      </w:r>
+      <w:r>
+        <w:rPr>
+          <w:rFonts w:ascii="Times New Roman" w:eastAsia="宋体" w:hAnsi="Times New Roman"/>
+          <w:sz w:val="24"/>
+        </w:rPr>
+        <w:t xml:space="preserve"> OH </w:t>
+      </w:r>
+      <w:r>
+        <w:rPr>
+          <w:rFonts w:ascii="Times New Roman" w:eastAsia="宋体" w:hAnsi="Times New Roman"/>
+          <w:sz w:val="24"/>
+        </w:rPr>
+        <w:t>驱动信号。这验证了以矢量（相量）而非标量方式扣除源季节性的必要性与有效性。</w:t>
+      </w:r>
+    </w:p>
+    <w:p>
+      <w:pPr>
+        <w:spacing w:after="80" w:line="360" w:lineRule="auto"/>
+      </w:pPr>
+      <w:r>
+        <w:rPr>
+          <w:rFonts w:ascii="Times New Roman" w:eastAsia="宋体" w:hAnsi="Times New Roman"/>
+          <w:sz w:val="24"/>
+        </w:rPr>
+        <w:t xml:space="preserve">3. </w:t>
+      </w:r>
+      <w:r>
+        <w:rPr>
+          <w:rFonts w:ascii="Times New Roman" w:eastAsia="宋体" w:hAnsi="Times New Roman"/>
+          <w:b/>
+          <w:sz w:val="24"/>
+        </w:rPr>
+        <w:t xml:space="preserve">δ¹³C-CH₄ </w:t>
+      </w:r>
+      <w:r>
+        <w:rPr>
+          <w:rFonts w:ascii="Times New Roman" w:eastAsia="宋体" w:hAnsi="Times New Roman"/>
+          <w:b/>
+          <w:sz w:val="24"/>
+        </w:rPr>
+        <w:t>季节振幅信号可稳健提取并呈现弱变化趋势。</w:t>
+      </w:r>
+      <w:r>
+        <w:rPr>
+          <w:rFonts w:ascii="Times New Roman" w:eastAsia="宋体" w:hAnsi="Times New Roman"/>
+          <w:sz w:val="24"/>
+        </w:rPr>
+        <w:t xml:space="preserve"> </w:t>
+      </w:r>
+      <w:r>
+        <w:rPr>
+          <w:rFonts w:ascii="Times New Roman" w:eastAsia="宋体" w:hAnsi="Times New Roman"/>
+          <w:sz w:val="24"/>
+        </w:rPr>
+        <w:t>覆盖度筛选结合谐波拟合可从</w:t>
+      </w:r>
+      <w:r>
+        <w:rPr>
+          <w:rFonts w:ascii="Times New Roman" w:eastAsia="宋体" w:hAnsi="Times New Roman"/>
+          <w:sz w:val="24"/>
+        </w:rPr>
+        <w:t xml:space="preserve"> 24 </w:t>
+      </w:r>
+      <w:r>
+        <w:rPr>
+          <w:rFonts w:ascii="Times New Roman" w:eastAsia="宋体" w:hAnsi="Times New Roman"/>
+          <w:sz w:val="24"/>
+        </w:rPr>
+        <w:t>个站点的瓶采样中稳定获得季节振幅：</w:t>
+      </w:r>
+      <w:r>
+        <w:rPr>
+          <w:rFonts w:ascii="Times New Roman" w:eastAsia="宋体" w:hAnsi="Times New Roman"/>
+          <w:sz w:val="24"/>
+        </w:rPr>
+        <w:t xml:space="preserve">2002–2022 </w:t>
+      </w:r>
+      <w:r>
+        <w:rPr>
+          <w:rFonts w:ascii="Times New Roman" w:eastAsia="宋体" w:hAnsi="Times New Roman"/>
+          <w:sz w:val="24"/>
+        </w:rPr>
+        <w:t>年呈弱的正向趋势（网络中位约</w:t>
+      </w:r>
+      <w:r>
+        <w:rPr>
+          <w:rFonts w:ascii="Times New Roman" w:eastAsia="宋体" w:hAnsi="Times New Roman"/>
+          <w:sz w:val="24"/>
+        </w:rPr>
+        <w:t xml:space="preserve"> +0.034‰/decade</w:t>
+      </w:r>
+      <w:r>
+        <w:rPr>
+          <w:rFonts w:ascii="Times New Roman" w:eastAsia="宋体" w:hAnsi="Times New Roman"/>
+          <w:sz w:val="24"/>
+        </w:rPr>
+        <w:t>，</w:t>
+      </w:r>
+      <w:r>
+        <w:rPr>
+          <w:rFonts w:ascii="Times New Roman" w:eastAsia="宋体" w:hAnsi="Times New Roman"/>
+          <w:sz w:val="24"/>
+        </w:rPr>
+        <w:t xml:space="preserve">12 </w:t>
+      </w:r>
+      <w:r>
+        <w:rPr>
+          <w:rFonts w:ascii="Times New Roman" w:eastAsia="宋体" w:hAnsi="Times New Roman"/>
+          <w:sz w:val="24"/>
+        </w:rPr>
+        <w:t>站中</w:t>
+      </w:r>
+      <w:r>
+        <w:rPr>
+          <w:rFonts w:ascii="Times New Roman" w:eastAsia="宋体" w:hAnsi="Times New Roman"/>
+          <w:sz w:val="24"/>
+        </w:rPr>
+        <w:t xml:space="preserve"> 11 </w:t>
+      </w:r>
+      <w:r>
+        <w:rPr>
+          <w:rFonts w:ascii="Times New Roman" w:eastAsia="宋体" w:hAnsi="Times New Roman"/>
+          <w:sz w:val="24"/>
+        </w:rPr>
+        <w:t>站为正），</w:t>
+      </w:r>
+      <w:r>
+        <w:rPr>
+          <w:rFonts w:ascii="Times New Roman" w:eastAsia="宋体" w:hAnsi="Times New Roman"/>
+          <w:sz w:val="24"/>
+        </w:rPr>
+        <w:t xml:space="preserve">2016–2022 </w:t>
+      </w:r>
+      <w:r>
+        <w:rPr>
+          <w:rFonts w:ascii="Times New Roman" w:eastAsia="宋体" w:hAnsi="Times New Roman"/>
+          <w:sz w:val="24"/>
+        </w:rPr>
+        <w:t>年呈更强且符号一致的近期正向趋势（中位约</w:t>
+      </w:r>
+      <w:r>
+        <w:rPr>
+          <w:rFonts w:ascii="Times New Roman" w:eastAsia="宋体" w:hAnsi="Times New Roman"/>
+          <w:sz w:val="24"/>
+        </w:rPr>
+        <w:t xml:space="preserve"> +0.13‰/decade</w:t>
+      </w:r>
+      <w:r>
+        <w:rPr>
+          <w:rFonts w:ascii="Times New Roman" w:eastAsia="宋体" w:hAnsi="Times New Roman"/>
+          <w:sz w:val="24"/>
+        </w:rPr>
+        <w:t>，</w:t>
+      </w:r>
+      <w:r>
+        <w:rPr>
+          <w:rFonts w:ascii="Times New Roman" w:eastAsia="宋体" w:hAnsi="Times New Roman"/>
+          <w:sz w:val="24"/>
+        </w:rPr>
+        <w:t xml:space="preserve">20 </w:t>
+      </w:r>
+      <w:r>
+        <w:rPr>
+          <w:rFonts w:ascii="Times New Roman" w:eastAsia="宋体" w:hAnsi="Times New Roman"/>
+          <w:sz w:val="24"/>
+        </w:rPr>
+        <w:t>站全部为正），且对三种</w:t>
+      </w:r>
+      <w:r>
+        <w:rPr>
+          <w:rFonts w:ascii="Times New Roman" w:eastAsia="宋体" w:hAnsi="Times New Roman"/>
+          <w:sz w:val="24"/>
+        </w:rPr>
+        <w:t xml:space="preserve"> SCA </w:t>
+      </w:r>
+      <w:r>
+        <w:rPr>
+          <w:rFonts w:ascii="Times New Roman" w:eastAsia="宋体" w:hAnsi="Times New Roman"/>
+          <w:sz w:val="24"/>
+        </w:rPr>
+        <w:t>定义与</w:t>
+      </w:r>
+      <w:r>
+        <w:rPr>
+          <w:rFonts w:ascii="Times New Roman" w:eastAsia="宋体" w:hAnsi="Times New Roman"/>
+          <w:sz w:val="24"/>
+        </w:rPr>
+        <w:t xml:space="preserve"> OLS/Theil–Sen </w:t>
+      </w:r>
+      <w:r>
+        <w:rPr>
+          <w:rFonts w:ascii="Times New Roman" w:eastAsia="宋体" w:hAnsi="Times New Roman"/>
+          <w:sz w:val="24"/>
+        </w:rPr>
+        <w:t>两种估计量均稳健。这为双同位素季节循环分析提供了可靠的方法基础。</w:t>
+      </w:r>
+    </w:p>
+    <w:p>
+      <w:pPr>
+        <w:spacing w:after="80" w:line="360" w:lineRule="auto"/>
+        <w:ind w:firstLine="480"/>
+      </w:pPr>
+      <w:r>
+        <w:rPr>
+          <w:rFonts w:ascii="Times New Roman" w:eastAsia="宋体" w:hAnsi="Times New Roman"/>
+          <w:sz w:val="24"/>
+        </w:rPr>
+        <w:t>需要说明的是，北半球站点经湿地校正后振幅比仍系统性偏高，残余的非湿地季节源（水稻、生物质燃烧）与</w:t>
+      </w:r>
+      <w:r>
+        <w:rPr>
+          <w:rFonts w:ascii="Times New Roman" w:eastAsia="宋体" w:hAnsi="Times New Roman"/>
+          <w:sz w:val="24"/>
+        </w:rPr>
+        <w:t xml:space="preserve"> Cl </w:t>
+      </w:r>
+      <w:r>
+        <w:rPr>
+          <w:rFonts w:ascii="Times New Roman" w:eastAsia="宋体" w:hAnsi="Times New Roman"/>
+          <w:sz w:val="24"/>
+        </w:rPr>
+        <w:t>季节性尚待处理，且南半球仅</w:t>
+      </w:r>
+      <w:r>
+        <w:rPr>
+          <w:rFonts w:ascii="Times New Roman" w:eastAsia="宋体" w:hAnsi="Times New Roman"/>
+          <w:sz w:val="24"/>
+        </w:rPr>
+        <w:t xml:space="preserve"> 2 </w:t>
+      </w:r>
+      <w:r>
+        <w:rPr>
+          <w:rFonts w:ascii="Times New Roman" w:eastAsia="宋体" w:hAnsi="Times New Roman"/>
+          <w:sz w:val="24"/>
+        </w:rPr>
+        <w:t>个洁净站点、其不确定度需保守对待。因此，开题后的主要工作是在统一的论文框架下系统化、严格化上述分析，并补强北半球残余偏差的处理与不确定性论证。</w:t>
       </w:r>
     </w:p>
     <w:p>
@@ -9213,7 +9762,6 @@
           <w:rFonts w:ascii="Times New Roman" w:eastAsia="宋体" w:hAnsi="Times New Roman"/>
           <w:sz w:val="24"/>
         </w:rPr>
-        <w:lastRenderedPageBreak/>
         <w:t xml:space="preserve">2.3 </w:t>
       </w:r>
       <w:r>
@@ -9302,6 +9850,7 @@
           <w:rFonts w:ascii="Times New Roman" w:eastAsia="宋体" w:hAnsi="Times New Roman"/>
           <w:sz w:val="24"/>
         </w:rPr>
+        <w:lastRenderedPageBreak/>
         <w:t xml:space="preserve">2.6 </w:t>
       </w:r>
       <w:r>
@@ -9845,7 +10394,6 @@
           <w:color w:val="000000"/>
           <w:sz w:val="28"/>
         </w:rPr>
-        <w:lastRenderedPageBreak/>
         <w:t>参考文献</w:t>
       </w:r>
     </w:p>
@@ -9870,7 +10418,14 @@
         <w:rPr>
           <w:rFonts w:ascii="Times New Roman" w:eastAsia="宋体" w:hAnsi="Times New Roman"/>
         </w:rPr>
-        <w:t>2. Bowen, G. J., and Revenaugh, J. (2003). Interpolating the isotopic composition of modern meteoric precipitation. *Water Resources Research*, 39, 1299. DOI: 10.1029/2003WR002086.</w:t>
+        <w:t xml:space="preserve">2. Bowen, G. J., and Revenaugh, J. (2003). Interpolating the isotopic composition of modern </w:t>
+      </w:r>
+      <w:r>
+        <w:rPr>
+          <w:rFonts w:ascii="Times New Roman" w:eastAsia="宋体" w:hAnsi="Times New Roman"/>
+        </w:rPr>
+        <w:lastRenderedPageBreak/>
+        <w:t>meteoric precipitation. *Water Resources Research*, 39, 1299. DOI: 10.1029/2003WR002086.</w:t>
       </w:r>
     </w:p>
     <w:p>
@@ -10007,14 +10562,7 @@
         <w:rPr>
           <w:rFonts w:ascii="Times New Roman" w:eastAsia="宋体" w:hAnsi="Times New Roman"/>
         </w:rPr>
-        <w:t xml:space="preserve">12. Holzer, M., and Waugh, D. W. (2015). Interhemispheric transit-time distributions and path-dependent lifetimes constrained by measurements of SF₆, CFCs, and CFC replacements. </w:t>
-      </w:r>
-      <w:r>
-        <w:rPr>
-          <w:rFonts w:ascii="Times New Roman" w:eastAsia="宋体" w:hAnsi="Times New Roman"/>
-        </w:rPr>
-        <w:lastRenderedPageBreak/>
-        <w:t>*Geophysical Research Letters*, 42. DOI: 10.1002/2015GL064172.</w:t>
+        <w:t>12. Holzer, M., and Waugh, D. W. (2015). Interhemispheric transit-time distributions and path-dependent lifetimes constrained by measurements of SF₆, CFCs, and CFC replacements. *Geophysical Research Letters*, 42. DOI: 10.1002/2015GL064172.</w:t>
       </w:r>
     </w:p>
     <w:p>
@@ -10038,7 +10586,14 @@
         <w:rPr>
           <w:rFonts w:ascii="Times New Roman" w:eastAsia="宋体" w:hAnsi="Times New Roman"/>
         </w:rPr>
-        <w:t>14. Joelsson, L. M. T., et al. (2016). Kinetic isotope effects of ¹²CH₃D + OH and ¹³CH₃D + OH from 278 to 313 K. *Atmospheric Chemistry and Physics*, 16, 4439–4449. DOI: 10.5194/acp-16-4439-2016.</w:t>
+        <w:t>14. Joelsson, L. M. T., et al. (2016). Kinetic isotope effects of ¹²CH₃D + OH and ¹³CH₃D + OH from 278 to 313 K. *Atmospheric Chemistry and Physics*, 16, 4439–4449. DOI: 10.5194/acp-16-</w:t>
+      </w:r>
+      <w:r>
+        <w:rPr>
+          <w:rFonts w:ascii="Times New Roman" w:eastAsia="宋体" w:hAnsi="Times New Roman"/>
+        </w:rPr>
+        <w:lastRenderedPageBreak/>
+        <w:t>4439-2016.</w:t>
       </w:r>
     </w:p>
     <w:p>
@@ -10138,8 +10693,15 @@
       <w:r>
         <w:rPr>
           <w:rFonts w:ascii="Times New Roman" w:eastAsia="宋体" w:hAnsi="Times New Roman"/>
-        </w:rPr>
-        <w:t>20. Michel, S. E., et al. (2023). Stable Isotopic Composition of Atmospheric Methane (¹³C) from the NOAA GML Carbon Cycle Cooperative Global Air Sampling Network, 1998–2022. Version 2023-09-21. DOI: 10.15138/9p89-1x02.</w:t>
+          <w:lang w:val="fr-FR"/>
+        </w:rPr>
+        <w:t xml:space="preserve">20. Michel, S. E., et al. </w:t>
+      </w:r>
+      <w:r>
+        <w:rPr>
+          <w:rFonts w:ascii="Times New Roman" w:eastAsia="宋体" w:hAnsi="Times New Roman"/>
+        </w:rPr>
+        <w:t>(2023). Stable Isotopic Composition of Atmospheric Methane (¹³C) from the NOAA GML Carbon Cycle Cooperative Global Air Sampling Network, 1998–2022. Version 2023-09-21. DOI: 10.15138/9p89-1x02.</w:t>
       </w:r>
     </w:p>
     <w:p>
@@ -10221,14 +10783,7 @@
         <w:rPr>
           <w:rFonts w:ascii="Times New Roman" w:eastAsia="宋体" w:hAnsi="Times New Roman"/>
         </w:rPr>
-        <w:t xml:space="preserve">(2011). TransCom model simulations of CH₄ and related species: linking </w:t>
-      </w:r>
-      <w:r>
-        <w:rPr>
-          <w:rFonts w:ascii="Times New Roman" w:eastAsia="宋体" w:hAnsi="Times New Roman"/>
-        </w:rPr>
-        <w:lastRenderedPageBreak/>
-        <w:t>transport, surface flux and chemical loss with CH₄ variability in the troposphere and lower stratosphere. *Atmospheric Chemistry and Physics*, 11, 12813–12837. DOI: 10.5194/acp-11-12813-2011.</w:t>
+        <w:t>(2011). TransCom model simulations of CH₄ and related species: linking transport, surface flux and chemical loss with CH₄ variability in the troposphere and lower stratosphere. *Atmospheric Chemistry and Physics*, 11, 12813–12837. DOI: 10.5194/acp-11-12813-2011.</w:t>
       </w:r>
     </w:p>
     <w:p>
@@ -10264,6 +10819,7 @@
         <w:rPr>
           <w:rFonts w:ascii="Times New Roman" w:eastAsia="宋体" w:hAnsi="Times New Roman"/>
         </w:rPr>
+        <w:lastRenderedPageBreak/>
         <w:t>26. Saueressig, G., et al. (1995). Carbon kinetic isotope effect in the reaction of CH₄ with Cl atoms. *Geophysical Research Letters*, 22, 1225–1228. DOI: 10.1029/95GL00881.</w:t>
       </w:r>
     </w:p>
@@ -10413,7 +10969,6 @@
         <w:rPr>
           <w:rFonts w:ascii="Times New Roman" w:eastAsia="宋体" w:hAnsi="Times New Roman"/>
         </w:rPr>
-        <w:lastRenderedPageBreak/>
         <w:t>36. Whiticar, M. J., Faber, E., and Schoell, M. (1986). Biogenic methane formation in marine and freshwater environments: CO₂ reduction vs. acetate fermentation—isotope evidence. *Geochimica et Cosmochimica Acta*, 50, 693–709. DOI: 10.1016/0016-7037(86)90346-7.</w:t>
       </w:r>
     </w:p>
@@ -10431,6 +10986,12 @@
     </w:p>
     <w:p>
       <w:pPr>
+        <w:widowControl/>
+        <w:jc w:val="left"/>
+      </w:pPr>
+    </w:p>
+    <w:p>
+      <w:pPr>
         <w:spacing w:line="312" w:lineRule="auto"/>
       </w:pPr>
     </w:p>
@@ -10438,7 +10999,7 @@
       <w:pPr>
         <w:spacing w:beforeLines="100" w:before="312" w:line="480" w:lineRule="auto"/>
         <w:rPr>
-          <w:rFonts w:ascii="Times New Roman" w:eastAsia="华文中宋" w:hAnsi="Times New Roman" w:cs="Times New Roman" w:hint="eastAsia"/>
+          <w:rFonts w:ascii="Times New Roman" w:eastAsia="华文中宋" w:hAnsi="Times New Roman" w:cs="Times New Roman"/>
           <w:sz w:val="40"/>
           <w:szCs w:val="36"/>
         </w:rPr>

</xml_diff>